<commit_message>
fix: protect resume upload and verify non-persistence
</commit_message>
<xml_diff>
--- a/docs/reports/CareerGraph_Recommender_Final_Report.docx
+++ b/docs/reports/CareerGraph_Recommender_Final_Report.docx
@@ -2626,7 +2626,16 @@
     </w:p>
     <w:p>
       <w:r>
-        <w:t>上传接口不调用 SQLite 写入或 CSV 输出逻辑；测试在请求前后比较六张表计数，确保上传分析不会新增 user_profiles 或 user_skill_events。</w:t>
+        <w:t>上传接口不调用 SQLite 写入或 CSV 输出逻辑；测试在请求前后比较六张表计数，并校验 resumes_zh.csv、user_profiles.csv、user_skill_events.csv 的 SHA-256 未改变，确保上传分析不会污染基准数据。</w:t>
+      </w:r>
+    </w:p>
+    <w:p>
+      <w:pPr>
+        <w:pStyle w:val="ListBullet"/>
+        <w:spacing w:after="40"/>
+      </w:pPr>
+      <w:r>
+        <w:t>页面通过 Django CSRF token 保护上传 POST；服务端显式限制单文件 1 MB 和请求体 2 MB。</w:t>
       </w:r>
     </w:p>
     <w:p>
@@ -3220,7 +3229,7 @@
         <w:spacing w:after="40"/>
       </w:pPr>
       <w:r>
-        <w:t>全量单元测试：36/36 通过，覆盖数据完整性、数据库外键关系、DataLoader、TemporalGAT 前向、推荐服务、二部图、Web 页面和上传接口。</w:t>
+        <w:t>全量单元测试：37/37 通过，覆盖数据完整性、数据库外键关系、DataLoader、TemporalGAT 前向、推荐服务、二部图、Web 页面、上传接口、CSRF 和不落库校验。</w:t>
       </w:r>
     </w:p>
     <w:p>

</xml_diff>